<commit_message>
AT3 practice: cleanup checklist as a reverse walk
The checklist missed things -- the alarms built at task 24 most obviously.
Rewritten as an explicit walk backwards through the run sheet, each step
naming the task that created what it removes: 24, T3, 22, 21, 21, 21, 20, 19.

Backwards is also the order that works, not just a tidy way to present it.
Each thing built depends on something built before it: the Auto Scaling group
has to be emptied before its subnet will delete, and the CloudFormation stack
owns the VPC so it goes last and refuses while anything hand-built is still
inside. Reverse-creation and dependency order are the same here.

The final check now looks for the two things that outlive everything else --
an allocated Elastic IP and an orphaned alarm -- rather than just the VPC.
The address is the one that keeps costing.

Co-Authored-By: Claude Opus 5 (1M context) <noreply@anthropic.com>
</commit_message>
<xml_diff>
--- a/S1-CL1-Cloud-Design-Build/delivery/practice/AT3-Practice-HA-Run-Sheet.docx
+++ b/S1-CL1-Cloud-Design-Build/delivery/practice/AT3-Practice-HA-Run-Sheet.docx
@@ -15664,7 +15664,7 @@
           <w:i w:val="0"/>
           <w:sz w:val="21"/>
         </w:rPr>
-        <w:t>Your lab has a credit budget, and everything above keeps spending it whether you are using it or not. When you have finished, unwind it in the order below.</w:t>
+        <w:t>Your lab has a credit budget, and everything you built keeps spending it whether you are using it or not. When you have finished, take it all back down.</w:t>
       </w:r>
     </w:p>
     <w:p>
@@ -15677,11 +15677,24 @@
           <w:i w:val="0"/>
           <w:sz w:val="21"/>
         </w:rPr>
-        <w:t>The order is not simply the reverse of the way you built it. The CloudFormation stack owns the network everything sits in, so it has to go last — and it will refuse to delete while anything you built by hand is still inside it.</w:t>
+        <w:t>Work BACKWARDS. The last thing you made is the first thing you remove, and you undo your way down to the stack you started with. That order is not just tidy — it is the order that works, because each thing you built depends on something built before it. The CloudFormation stack owns the network everything else sits in, so it goes last and will refuse to delete while anything you added by hand is still inside it.</w:t>
       </w:r>
     </w:p>
     <w:p>
       <w:pPr>
+        <w:spacing w:after="160"/>
+      </w:pPr>
+      <w:r>
+        <w:rPr>
+          <w:b w:val="0"/>
+          <w:i w:val="0"/>
+          <w:sz w:val="21"/>
+        </w:rPr>
+        <w:t>Each step below names the task that created the thing you are removing.</w:t>
+      </w:r>
+    </w:p>
+    <w:p>
+      <w:pPr>
         <w:spacing w:after="40"/>
       </w:pPr>
       <w:r>
@@ -15696,7 +15709,7 @@
           <w:b/>
           <w:sz w:val="21"/>
         </w:rPr>
-        <w:t>Empty the Auto Scaling group</w:t>
+        <w:t>Delete the alarms you created — task 24</w:t>
       </w:r>
     </w:p>
     <w:p>
@@ -15710,7 +15723,7 @@
           <w:i w:val="0"/>
           <w:sz w:val="19"/>
         </w:rPr>
-        <w:t>EC2 → Auto Scaling groups → your group → Capacity overview → Edit. Set Desired, Minimum and Maximum all to 0 and update. Wait until the Instance management tab is empty. Do not terminate the instances directly — the group will just launch replacements.</w:t>
+        <w:t>CloudWatch → Alarms → All alarms. Tick the alarms YOU created and choose Actions → Delete. Leave any alarm the lab-pack deployed; the stack removes those itself. If you are not sure which is which, yours are the ones you named.</w:t>
       </w:r>
     </w:p>
     <w:p>
@@ -15729,7 +15742,7 @@
           <w:b/>
           <w:sz w:val="21"/>
         </w:rPr>
-        <w:t>Delete the NAT gateway you created by hand</w:t>
+        <w:t>Undo the instance refresh, if you did one — test T3</w:t>
       </w:r>
     </w:p>
     <w:p>
@@ -15743,7 +15756,7 @@
           <w:i w:val="0"/>
           <w:sz w:val="19"/>
         </w:rPr>
-        <w:t>VPC → NAT gateways → select the one you made in task 21 → Actions → Delete. Wait until State reads Deleted. The stack's own NAT gateway is not yours to delete; the stack takes that one.</w:t>
+        <w:t>If you resized by changing the launch template, EC2 → Launch templates → your template → Versions. You can leave the extra version; it disappears with the stack. Nothing else to do here — an instance refresh leaves no separate resource behind.</w:t>
       </w:r>
     </w:p>
     <w:p>
@@ -15762,7 +15775,7 @@
           <w:b/>
           <w:sz w:val="21"/>
         </w:rPr>
-        <w:t>Release its Elastic IP</w:t>
+        <w:t>Empty the Auto Scaling group — task 22</w:t>
       </w:r>
     </w:p>
     <w:p>
@@ -15776,7 +15789,7 @@
           <w:i w:val="0"/>
           <w:sz w:val="19"/>
         </w:rPr>
-        <w:t>VPC → Elastic IPs. The one with no Name and nothing associated is the address that NAT gateway was using — deleting the gateway does not release it, and an unattached address bills by the hour. Select it → Actions → Release Elastic IP addresses. If the release fails, the gateway has not finished deleting; wait two minutes and try again.</w:t>
+        <w:t>EC2 → Auto Scaling groups → your group → Capacity overview → Edit. Set Desired, Minimum and Maximum all to 0 and update. Wait until the Instance management tab is empty. Do this before you touch the subnet — and do not terminate the instances directly, because the group will just replace them.</w:t>
       </w:r>
     </w:p>
     <w:p>
@@ -15795,7 +15808,7 @@
           <w:b/>
           <w:sz w:val="21"/>
         </w:rPr>
-        <w:t>Delete the route table you created by hand</w:t>
+        <w:t>Delete the route table you created — task 21</w:t>
       </w:r>
     </w:p>
     <w:p>
@@ -15809,7 +15822,7 @@
           <w:i w:val="0"/>
           <w:sz w:val="19"/>
         </w:rPr>
-        <w:t>VPC → Route tables → the one you made in task 21 → Actions → Delete route table. Deleting it removes its subnet association for you.</w:t>
+        <w:t>VPC → Route tables → the one you made → Actions → Delete route table. Deleting it removes its subnet association for you.</w:t>
       </w:r>
     </w:p>
     <w:p>
@@ -15828,7 +15841,7 @@
           <w:b/>
           <w:sz w:val="21"/>
         </w:rPr>
-        <w:t>Delete the subnet you created by hand</w:t>
+        <w:t>Delete the NAT gateway you created — task 21</w:t>
       </w:r>
     </w:p>
     <w:p>
@@ -15842,7 +15855,7 @@
           <w:i w:val="0"/>
           <w:sz w:val="19"/>
         </w:rPr>
-        <w:t>VPC → Subnets → the one you made in task 20 → Actions → Delete subnet. If it refuses because of a network interface, something in it has not finished terminating — wait a couple of minutes and try again.</w:t>
+        <w:t>VPC → NAT gateways → the one you made → Actions → Delete. Wait until State reads Deleted. The lab-pack's own NAT gateway is not yours to remove; the stack takes that one.</w:t>
       </w:r>
     </w:p>
     <w:p>
@@ -15861,7 +15874,7 @@
           <w:b/>
           <w:sz w:val="21"/>
         </w:rPr>
-        <w:t>Delete the CloudFormation stack</w:t>
+        <w:t>Release the Elastic IP that NAT gateway used — task 21</w:t>
       </w:r>
     </w:p>
     <w:p>
@@ -15875,7 +15888,7 @@
           <w:i w:val="0"/>
           <w:sz w:val="19"/>
         </w:rPr>
-        <w:t>CloudFormation → your stack → Delete. This takes everything else with it: the VPC, the remaining subnets, the load balancer, the database, the launch template, the alarms and the stack's own NAT gateway and Elastic IP. Wait for it to disappear from the list.</w:t>
+        <w:t>VPC → Elastic IPs. The one with no Name and nothing associated is it — deleting a NAT gateway does NOT release its address, and an unattached address bills by the hour. Select it → Actions → Release Elastic IP addresses. If the release fails, the gateway has not finished deleting; wait two minutes and try again.</w:t>
       </w:r>
     </w:p>
     <w:p>
@@ -15894,7 +15907,7 @@
           <w:b/>
           <w:sz w:val="21"/>
         </w:rPr>
-        <w:t>Check nothing survived</w:t>
+        <w:t>Delete the subnet you created — task 20</w:t>
       </w:r>
     </w:p>
     <w:p>
@@ -15908,7 +15921,73 @@
           <w:i w:val="0"/>
           <w:sz w:val="19"/>
         </w:rPr>
-        <w:t>VPC → Your VPCs should no longer list yours. Check Elastic IPs is empty — an address left allocated is the most common thing to miss, and the only one that keeps costing after everything else is gone.</w:t>
+        <w:t>VPC → Subnets → the one you made → Actions → Delete subnet. If it refuses because of a network interface, something in it has not finished terminating — wait a couple of minutes and try again.</w:t>
+      </w:r>
+    </w:p>
+    <w:p>
+      <w:pPr>
+        <w:spacing w:after="40"/>
+      </w:pPr>
+      <w:r>
+        <w:rPr>
+          <w:b/>
+          <w:sz w:val="21"/>
+        </w:rPr>
+        <w:t xml:space="preserve">8.  </w:t>
+      </w:r>
+      <w:r>
+        <w:rPr>
+          <w:b/>
+          <w:sz w:val="21"/>
+        </w:rPr>
+        <w:t>Delete the CloudFormation stack — task 19</w:t>
+      </w:r>
+    </w:p>
+    <w:p>
+      <w:pPr>
+        <w:spacing w:after="160"/>
+        <w:ind w:left="340"/>
+      </w:pPr>
+      <w:r>
+        <w:rPr>
+          <w:b w:val="0"/>
+          <w:i w:val="0"/>
+          <w:sz w:val="19"/>
+        </w:rPr>
+        <w:t>CloudFormation → your stack → Delete. This takes everything the lab-pack built: the VPC, its subnets, the load balancer, the target group, the database, the launch template, the lab-pack's alarm and NAT gateway, and the notification topic. Wait for it to leave the list.</w:t>
+      </w:r>
+    </w:p>
+    <w:p>
+      <w:pPr>
+        <w:spacing w:after="40"/>
+      </w:pPr>
+      <w:r>
+        <w:rPr>
+          <w:b/>
+          <w:sz w:val="21"/>
+        </w:rPr>
+        <w:t xml:space="preserve">9.  </w:t>
+      </w:r>
+      <w:r>
+        <w:rPr>
+          <w:b/>
+          <w:sz w:val="21"/>
+        </w:rPr>
+        <w:t>Check nothing survived</w:t>
+      </w:r>
+    </w:p>
+    <w:p>
+      <w:pPr>
+        <w:spacing w:after="160"/>
+        <w:ind w:left="340"/>
+      </w:pPr>
+      <w:r>
+        <w:rPr>
+          <w:b w:val="0"/>
+          <w:i w:val="0"/>
+          <w:sz w:val="19"/>
+        </w:rPr>
+        <w:t>VPC → Your VPCs should no longer list yours. Then check Elastic IPs is empty and CloudWatch → Alarms has none of yours left. An allocated address and an orphaned alarm are the two things that outlive everything else, and the address is the one that keeps costing.</w:t>
       </w:r>
     </w:p>
     <w:sectPr>

</xml_diff>